<commit_message>
docs: миграция REG.RU VPS → Beget для boat и klinker
Уточнены DNS в REG.RU/Beget, бэкап с REG.RU, пути .env и cutover.

Co-authored-by: Igor-Lark <Igor-Lark@users.noreply.github.com>
</commit_message>
<xml_diff>
--- a/docs/beget-migration-boat-klinker.docx
+++ b/docs/beget-migration-boat-klinker.docx
@@ -18,7 +18,7 @@
           <w:i/>
           <w:sz w:val="22"/>
         </w:rPr>
-        <w:t>Подробная инструкция по миграции двух ИИ-ботов с текущего VPS (webtaxi2.ru) на виртуальный сервер Beget. Документ подготовлен: 21 августа 2026 г.</w:t>
+        <w:t>Подробная инструкция по миграции двух ИИ-ботов с VPS REG.RU (сейчас: boat.webtaxi2.ru и klinker.webtaxi2.ru) на виртуальный сервер Beget. Документ обновлён: 4 октября 2026 г.</w:t>
       </w:r>
     </w:p>
     <w:p/>
@@ -450,7 +450,207 @@
           <w:i w:val="0"/>
           <w:sz w:val="22"/>
         </w:rPr>
-        <w:t>После переноса старый VPS (webtaxi2.ru) можно отключить, когда новые адреса протестированы и виджеты на Tilda обновлены.</w:t>
+        <w:t>После переноса VPS на REG.RU можно отключить (или оставить резервом на 1–2 недели), когда новые адреса протестированы и виджеты на Tilda обновлены.</w:t>
+      </w:r>
+    </w:p>
+    <w:p>
+      <w:pPr>
+        <w:pStyle w:val="Heading2"/>
+      </w:pPr>
+      <w:r>
+        <w:t>1.1. Где что лежит сейчас (REG.RU)</w:t>
+      </w:r>
+    </w:p>
+    <w:tbl>
+      <w:tblPr>
+        <w:tblStyle w:val="TableGrid"/>
+        <w:tblW w:type="auto" w:w="0"/>
+        <w:tblLook w:firstColumn="1" w:firstRow="1" w:lastColumn="0" w:lastRow="0" w:noHBand="0" w:noVBand="1" w:val="04A0"/>
+      </w:tblPr>
+      <w:tblGrid>
+        <w:gridCol w:w="2880"/>
+        <w:gridCol w:w="2880"/>
+        <w:gridCol w:w="2880"/>
+      </w:tblGrid>
+      <w:tr>
+        <w:tc>
+          <w:tcPr>
+            <w:tcW w:type="dxa" w:w="2880"/>
+          </w:tcPr>
+          <w:p>
+            <w:r>
+              <w:rPr>
+                <w:b/>
+              </w:rPr>
+              <w:t>Что</w:t>
+            </w:r>
+          </w:p>
+        </w:tc>
+        <w:tc>
+          <w:tcPr>
+            <w:tcW w:type="dxa" w:w="2880"/>
+          </w:tcPr>
+          <w:p>
+            <w:r>
+              <w:rPr>
+                <w:b/>
+              </w:rPr>
+              <w:t>Где сейчас (REG.RU VPS)</w:t>
+            </w:r>
+          </w:p>
+        </w:tc>
+        <w:tc>
+          <w:tcPr>
+            <w:tcW w:type="dxa" w:w="2880"/>
+          </w:tcPr>
+          <w:p>
+            <w:r>
+              <w:rPr>
+                <w:b/>
+              </w:rPr>
+              <w:t>Куда (Beget VPS)</w:t>
+            </w:r>
+          </w:p>
+        </w:tc>
+      </w:tr>
+      <w:tr>
+        <w:tc>
+          <w:tcPr>
+            <w:tcW w:type="dxa" w:w="2880"/>
+          </w:tcPr>
+          <w:p>
+            <w:r>
+              <w:t>Boat Sochi</w:t>
+            </w:r>
+          </w:p>
+        </w:tc>
+        <w:tc>
+          <w:tcPr>
+            <w:tcW w:type="dxa" w:w="2880"/>
+          </w:tcPr>
+          <w:p>
+            <w:r>
+              <w:t>/var/www/boat-sochi-bot, порт 3000</w:t>
+            </w:r>
+          </w:p>
+        </w:tc>
+        <w:tc>
+          <w:tcPr>
+            <w:tcW w:type="dxa" w:w="2880"/>
+          </w:tcPr>
+          <w:p>
+            <w:r>
+              <w:t>тот же путь или /var/www/boat-sochi-bot</w:t>
+            </w:r>
+          </w:p>
+        </w:tc>
+      </w:tr>
+      <w:tr>
+        <w:tc>
+          <w:tcPr>
+            <w:tcW w:type="dxa" w:w="2880"/>
+          </w:tcPr>
+          <w:p>
+            <w:r>
+              <w:t>KlinkerPro</w:t>
+            </w:r>
+          </w:p>
+        </w:tc>
+        <w:tc>
+          <w:tcPr>
+            <w:tcW w:type="dxa" w:w="2880"/>
+          </w:tcPr>
+          <w:p>
+            <w:r>
+              <w:t>~/igor/bots/klinkerpro-bot или /var/www/igor-klinker, порт 3001</w:t>
+            </w:r>
+          </w:p>
+        </w:tc>
+        <w:tc>
+          <w:tcPr>
+            <w:tcW w:type="dxa" w:w="2880"/>
+          </w:tcPr>
+          <w:p>
+            <w:r>
+              <w:t>/var/www/igor/bots/klinkerpro-bot</w:t>
+            </w:r>
+          </w:p>
+        </w:tc>
+      </w:tr>
+      <w:tr>
+        <w:tc>
+          <w:tcPr>
+            <w:tcW w:type="dxa" w:w="2880"/>
+          </w:tcPr>
+          <w:p>
+            <w:r>
+              <w:t>DNS boat/klinker</w:t>
+            </w:r>
+          </w:p>
+        </w:tc>
+        <w:tc>
+          <w:tcPr>
+            <w:tcW w:type="dxa" w:w="2880"/>
+          </w:tcPr>
+          <w:p>
+            <w:r>
+              <w:t>Панель REG.RU → DNS зона webtaxi2.ru (A-записи)</w:t>
+            </w:r>
+          </w:p>
+        </w:tc>
+        <w:tc>
+          <w:tcPr>
+            <w:tcW w:type="dxa" w:w="2880"/>
+          </w:tcPr>
+          <w:p>
+            <w:r>
+              <w:t>REG.RU или Beget — см. раздел 3</w:t>
+            </w:r>
+          </w:p>
+        </w:tc>
+      </w:tr>
+      <w:tr>
+        <w:tc>
+          <w:tcPr>
+            <w:tcW w:type="dxa" w:w="2880"/>
+          </w:tcPr>
+          <w:p>
+            <w:r>
+              <w:t>SSL</w:t>
+            </w:r>
+          </w:p>
+        </w:tc>
+        <w:tc>
+          <w:tcPr>
+            <w:tcW w:type="dxa" w:w="2880"/>
+          </w:tcPr>
+          <w:p>
+            <w:r>
+              <w:t>Let's Encrypt на старом VPS (certbot)</w:t>
+            </w:r>
+          </w:p>
+        </w:tc>
+        <w:tc>
+          <w:tcPr>
+            <w:tcW w:type="dxa" w:w="2880"/>
+          </w:tcPr>
+          <w:p>
+            <w:r>
+              <w:t>Новый certbot на Beget после nginx</w:t>
+            </w:r>
+          </w:p>
+        </w:tc>
+      </w:tr>
+    </w:tbl>
+    <w:p/>
+    <w:p>
+      <w:r>
+        <w:rPr>
+          <w:b w:val="0"/>
+          <w:i w:val="0"/>
+          <w:sz w:val="22"/>
+        </w:rPr>
+        <w:t>SSH на старый сервер: логин и IP из личного кабинета REG.RU → «VPS» → ваш сервер. Перед миграцией сохраните .env и список процессов: pm2 list или systemctl list-units '*bot*'.</w:t>
       </w:r>
     </w:p>
     <w:p>
@@ -800,7 +1000,7 @@
         <w:pStyle w:val="Heading2"/>
       </w:pPr>
       <w:r>
-        <w:t>3.2. Вариант B — оставить webtaxi2.ru</w:t>
+        <w:t>3.2. Вариант B — оставить boat.webtaxi2.ru и klinker.webtaxi2.ru (удобнее)</w:t>
       </w:r>
     </w:p>
     <w:p>
@@ -810,7 +1010,205 @@
           <w:i w:val="0"/>
           <w:sz w:val="22"/>
         </w:rPr>
-        <w:t>Если зона webtaxi2.ru тоже на Beget, можно просто сменить A-записи boat и klinker на IP нового VPS (вместо старого сервера). URL не меняются — Tilda трогать не нужно.</w:t>
+        <w:t>URL ботов не меняются — на Tilda менять embed.js не нужно. Меняется только IP в DNS.</w:t>
+      </w:r>
+    </w:p>
+    <w:p>
+      <w:pPr>
+        <w:pStyle w:val="Heading3"/>
+      </w:pPr>
+      <w:r>
+        <w:t>3.2.1. DNS в REG.RU (если webtaxi2.ru обслуживается REG.RU)</w:t>
+      </w:r>
+    </w:p>
+    <w:p>
+      <w:r>
+        <w:rPr>
+          <w:b w:val="0"/>
+          <w:i w:val="0"/>
+          <w:sz w:val="22"/>
+        </w:rPr>
+        <w:t>Личный кабинет REG.RU → «Домены» → webtaxi2.ru → «Управление зоной DNS» / «Ресурсные записи»:</w:t>
+      </w:r>
+    </w:p>
+    <w:tbl>
+      <w:tblPr>
+        <w:tblStyle w:val="TableGrid"/>
+        <w:tblW w:type="auto" w:w="0"/>
+        <w:tblLook w:firstColumn="1" w:firstRow="1" w:lastColumn="0" w:lastRow="0" w:noHBand="0" w:noVBand="1" w:val="04A0"/>
+      </w:tblPr>
+      <w:tblGrid>
+        <w:gridCol w:w="2160"/>
+        <w:gridCol w:w="2160"/>
+        <w:gridCol w:w="2160"/>
+        <w:gridCol w:w="2160"/>
+      </w:tblGrid>
+      <w:tr>
+        <w:tc>
+          <w:tcPr>
+            <w:tcW w:type="dxa" w:w="2160"/>
+          </w:tcPr>
+          <w:p>
+            <w:r>
+              <w:rPr>
+                <w:b/>
+              </w:rPr>
+              <w:t>Тип</w:t>
+            </w:r>
+          </w:p>
+        </w:tc>
+        <w:tc>
+          <w:tcPr>
+            <w:tcW w:type="dxa" w:w="2160"/>
+          </w:tcPr>
+          <w:p>
+            <w:r>
+              <w:rPr>
+                <w:b/>
+              </w:rPr>
+              <w:t>Поддомен (хост)</w:t>
+            </w:r>
+          </w:p>
+        </w:tc>
+        <w:tc>
+          <w:tcPr>
+            <w:tcW w:type="dxa" w:w="2160"/>
+          </w:tcPr>
+          <w:p>
+            <w:r>
+              <w:rPr>
+                <w:b/>
+              </w:rPr>
+              <w:t>Было (IP REG.RU VPS)</w:t>
+            </w:r>
+          </w:p>
+        </w:tc>
+        <w:tc>
+          <w:tcPr>
+            <w:tcW w:type="dxa" w:w="2160"/>
+          </w:tcPr>
+          <w:p>
+            <w:r>
+              <w:rPr>
+                <w:b/>
+              </w:rPr>
+              <w:t>Стало</w:t>
+            </w:r>
+          </w:p>
+        </w:tc>
+      </w:tr>
+      <w:tr>
+        <w:tc>
+          <w:tcPr>
+            <w:tcW w:type="dxa" w:w="2160"/>
+          </w:tcPr>
+          <w:p>
+            <w:r>
+              <w:t>A</w:t>
+            </w:r>
+          </w:p>
+        </w:tc>
+        <w:tc>
+          <w:tcPr>
+            <w:tcW w:type="dxa" w:w="2160"/>
+          </w:tcPr>
+          <w:p>
+            <w:r>
+              <w:t>boat</w:t>
+            </w:r>
+          </w:p>
+        </w:tc>
+        <w:tc>
+          <w:tcPr>
+            <w:tcW w:type="dxa" w:w="2160"/>
+          </w:tcPr>
+          <w:p>
+            <w:r>
+              <w:t>старый IP VPS REG.RU</w:t>
+            </w:r>
+          </w:p>
+        </w:tc>
+        <w:tc>
+          <w:tcPr>
+            <w:tcW w:type="dxa" w:w="2160"/>
+          </w:tcPr>
+          <w:p>
+            <w:r>
+              <w:t>новый IP VPS Beget</w:t>
+            </w:r>
+          </w:p>
+        </w:tc>
+      </w:tr>
+      <w:tr>
+        <w:tc>
+          <w:tcPr>
+            <w:tcW w:type="dxa" w:w="2160"/>
+          </w:tcPr>
+          <w:p>
+            <w:r>
+              <w:t>A</w:t>
+            </w:r>
+          </w:p>
+        </w:tc>
+        <w:tc>
+          <w:tcPr>
+            <w:tcW w:type="dxa" w:w="2160"/>
+          </w:tcPr>
+          <w:p>
+            <w:r>
+              <w:t>klinker</w:t>
+            </w:r>
+          </w:p>
+        </w:tc>
+        <w:tc>
+          <w:tcPr>
+            <w:tcW w:type="dxa" w:w="2160"/>
+          </w:tcPr>
+          <w:p>
+            <w:r>
+              <w:t>старый IP VPS REG.RU</w:t>
+            </w:r>
+          </w:p>
+        </w:tc>
+        <w:tc>
+          <w:tcPr>
+            <w:tcW w:type="dxa" w:w="2160"/>
+          </w:tcPr>
+          <w:p>
+            <w:r>
+              <w:t>новый IP VPS Beget</w:t>
+            </w:r>
+          </w:p>
+        </w:tc>
+      </w:tr>
+    </w:tbl>
+    <w:p/>
+    <w:p>
+      <w:r>
+        <w:rPr>
+          <w:b w:val="0"/>
+          <w:i w:val="0"/>
+          <w:sz w:val="22"/>
+        </w:rPr>
+        <w:t>Сохраните записи. TTL после смены: подождите 5–30 минут (иногда до 2 часов). Пока DNS не переключили — тестируйте ботов на Beget по curl к IP или через временный поддомен (вариант A).</w:t>
+      </w:r>
+    </w:p>
+    <w:p>
+      <w:pPr>
+        <w:pStyle w:val="Heading3"/>
+      </w:pPr>
+      <w:r>
+        <w:t>3.2.2. DNS в Beget (если зону webtaxi2.ru уже перенесли на Beget)</w:t>
+      </w:r>
+    </w:p>
+    <w:p>
+      <w:r>
+        <w:rPr>
+          <w:b w:val="0"/>
+          <w:i w:val="0"/>
+          <w:sz w:val="22"/>
+        </w:rPr>
+        <w:t>Beget → «Домены» → webtaxi2.ru → DNS → те же A-записи boat и klinker на IP Beget VPS.</w:t>
       </w:r>
     </w:p>
     <w:tbl>
@@ -1417,7 +1815,13 @@
           <w:rFonts w:ascii="Consolas" w:hAnsi="Consolas"/>
           <w:sz w:val="18"/>
         </w:rPr>
-        <w:t>scp root@СТАРЫЙ_IP:/var/www/boat-sochi-bot/.env deploy@НОВЫЙ_IP:/var/www/boat-sochi-bot/.env</w:t>
+        <w:t># Старый IP — из REG.RU → VPS; новый IP — из письма Beget после заказа VPS</w:t>
+        <w:br/>
+        <w:t>scp root@СТАРЫЙ_IP_REGRU:/var/www/boat-sochi-bot/.env deploy@НОВЫЙ_IP_BEGET:/var/www/boat-sochi-bot/.env</w:t>
+        <w:br/>
+        <w:t># Klinker .env (путь на REG.RU может отличаться):</w:t>
+        <w:br/>
+        <w:t>scp root@СТАРЫЙ_IP_REGRU:/var/www/igor/bots/klinkerpro-bot/.env deploy@НОВЫЙ_IP_BEGET:/var/www/igor/bots/klinkerpro-bot/.env</w:t>
       </w:r>
     </w:p>
     <w:p>
@@ -2277,7 +2681,7 @@
           <w:rFonts w:ascii="Consolas" w:hAnsi="Consolas"/>
           <w:sz w:val="18"/>
         </w:rPr>
-        <w:t># на старом VPS:</w:t>
+        <w:t># на VPS REG.RU (по SSH):</w:t>
         <w:br/>
         <w:t>tar czf ~/backup-bots-$(date +%Y%m%d).tar.gz \</w:t>
         <w:br/>
@@ -2285,9 +2689,28 @@
         <w:br/>
         <w:t xml:space="preserve">  /var/www/boat-sochi-bot/knowledge \</w:t>
         <w:br/>
+        <w:t xml:space="preserve">  /var/www/igor/bots/klinkerpro-bot/.env \</w:t>
+        <w:br/>
         <w:t xml:space="preserve">  ~/igor/bots/klinkerpro-bot/.env 2&gt;/dev/null</w:t>
         <w:br/>
-        <w:t>scp root@СТАРЫЙ_IP:~/backup-bots-*.tar.gz .</w:t>
+        <w:t>pm2 save</w:t>
+        <w:br/>
+        <w:t>pm2 list &gt; ~/pm2-list.txt</w:t>
+        <w:br/>
+        <w:br/>
+        <w:t># скачать архив на свой ПК:</w:t>
+        <w:br/>
+        <w:t>scp root@СТАРЫЙ_IP_REGRU:~/backup-bots-*.tar.gz .</w:t>
+      </w:r>
+    </w:p>
+    <w:p>
+      <w:r>
+        <w:rPr>
+          <w:b w:val="0"/>
+          <w:i w:val="0"/>
+          <w:sz w:val="22"/>
+        </w:rPr>
+        <w:t>После успешной миграции: REG.RU → VPS → остановить сервисы (pm2 stop all) и позже удалить/не продлевать тариф.</w:t>
       </w:r>
     </w:p>
     <w:p>
@@ -3117,7 +3540,21 @@
         <w:rPr>
           <w:b/>
         </w:rPr>
-        <w:t xml:space="preserve">Текущий boat (старый VPS): </w:t>
+        <w:t xml:space="preserve">REG.RU — VPS и DNS: </w:t>
+      </w:r>
+      <w:r>
+        <w:rPr>
+          <w:color w:val="0563C1"/>
+        </w:rPr>
+        <w:t>https://www.reg.ru/user/account/</w:t>
+      </w:r>
+    </w:p>
+    <w:p>
+      <w:r>
+        <w:rPr>
+          <w:b/>
+        </w:rPr>
+        <w:t xml:space="preserve">Текущий boat (REG.RU VPS): </w:t>
       </w:r>
       <w:r>
         <w:rPr>
@@ -3131,7 +3568,7 @@
         <w:rPr>
           <w:b/>
         </w:rPr>
-        <w:t xml:space="preserve">Текущий klinker (старый VPS): </w:t>
+        <w:t xml:space="preserve">Текущий klinker (REG.RU VPS): </w:t>
       </w:r>
       <w:r>
         <w:rPr>

</xml_diff>

<commit_message>
docs: полный перенос VPS REG.RU → Beget (rsync, DNS, pm2)
Добавлены инвентаризация, rsync /var/www, nginx/pm2/cron,
смена всех A-записей и cutover.

Co-authored-by: Igor-Lark <Igor-Lark@users.noreply.github.com>
</commit_message>
<xml_diff>
--- a/docs/beget-migration-boat-klinker.docx
+++ b/docs/beget-migration-boat-klinker.docx
@@ -8,7 +8,7 @@
         <w:jc w:val="center"/>
       </w:pPr>
       <w:r>
-        <w:t>Перенос ботов Boat Sochi и KlinkerPro на VPS Beget</w:t>
+        <w:t>Перенос VPS целиком: REG.RU → Beget (boat, klinker и всё содержимое)</w:t>
       </w:r>
     </w:p>
     <w:p>
@@ -18,7 +18,7 @@
           <w:i/>
           <w:sz w:val="22"/>
         </w:rPr>
-        <w:t>Подробная инструкция по миграции двух ИИ-ботов с VPS REG.RU (сейчас: boat.webtaxi2.ru и klinker.webtaxi2.ru) на виртуальный сервер Beget. Документ обновлён: 4 октября 2026 г.</w:t>
+        <w:t>Пошаговый перенос виртуального сервера REG.RU на VPS Beget: все проекты в /var/www, репозитории, nginx, SSL, pm2/systemd, cron и DNS. Ключевые сервисы: boat.webtaxi2.ru и klinker.webtaxi2.ru (боты для boat-sochi.ru и marmara-pro.ru). Документ обновлён: 6 октября 2026 г.</w:t>
       </w:r>
     </w:p>
     <w:p/>
@@ -39,6 +39,17 @@
           <w:sz w:val="22"/>
         </w:rPr>
         <w:t>1. Что переносим и зачем</w:t>
+      </w:r>
+    </w:p>
+    <w:p>
+      <w:pPr>
+        <w:pStyle w:val="ListBullet"/>
+      </w:pPr>
+      <w:r>
+        <w:rPr>
+          <w:sz w:val="22"/>
+        </w:rPr>
+        <w:t>1.2–1.5. Полный перенос VPS (инвентаризация, rsync, DNS, SSL)</w:t>
       </w:r>
     </w:p>
     <w:p>
@@ -655,6 +666,595 @@
     </w:p>
     <w:p>
       <w:pPr>
+        <w:pStyle w:val="Heading2"/>
+      </w:pPr>
+      <w:r>
+        <w:t>1.2. Два способа переноса (выберите один)</w:t>
+      </w:r>
+    </w:p>
+    <w:tbl>
+      <w:tblPr>
+        <w:tblStyle w:val="TableGrid"/>
+        <w:tblW w:type="auto" w:w="0"/>
+        <w:tblLook w:firstColumn="1" w:firstRow="1" w:lastColumn="0" w:lastRow="0" w:noHBand="0" w:noVBand="1" w:val="04A0"/>
+      </w:tblPr>
+      <w:tblGrid>
+        <w:gridCol w:w="2160"/>
+        <w:gridCol w:w="2160"/>
+        <w:gridCol w:w="2160"/>
+        <w:gridCol w:w="2160"/>
+      </w:tblGrid>
+      <w:tr>
+        <w:tc>
+          <w:tcPr>
+            <w:tcW w:type="dxa" w:w="2160"/>
+          </w:tcPr>
+          <w:p>
+            <w:r>
+              <w:rPr>
+                <w:b/>
+              </w:rPr>
+              <w:t>Способ</w:t>
+            </w:r>
+          </w:p>
+        </w:tc>
+        <w:tc>
+          <w:tcPr>
+            <w:tcW w:type="dxa" w:w="2160"/>
+          </w:tcPr>
+          <w:p>
+            <w:r>
+              <w:rPr>
+                <w:b/>
+              </w:rPr>
+              <w:t>Когда подходит</w:t>
+            </w:r>
+          </w:p>
+        </w:tc>
+        <w:tc>
+          <w:tcPr>
+            <w:tcW w:type="dxa" w:w="2160"/>
+          </w:tcPr>
+          <w:p>
+            <w:r>
+              <w:rPr>
+                <w:b/>
+              </w:rPr>
+              <w:t>Плюсы</w:t>
+            </w:r>
+          </w:p>
+        </w:tc>
+        <w:tc>
+          <w:tcPr>
+            <w:tcW w:type="dxa" w:w="2160"/>
+          </w:tcPr>
+          <w:p>
+            <w:r>
+              <w:rPr>
+                <w:b/>
+              </w:rPr>
+              <w:t>Минусы</w:t>
+            </w:r>
+          </w:p>
+        </w:tc>
+      </w:tr>
+      <w:tr>
+        <w:tc>
+          <w:tcPr>
+            <w:tcW w:type="dxa" w:w="2160"/>
+          </w:tcPr>
+          <w:p>
+            <w:r>
+              <w:t>A. Полный перенос данных (rsync)</w:t>
+            </w:r>
+          </w:p>
+        </w:tc>
+        <w:tc>
+          <w:tcPr>
+            <w:tcW w:type="dxa" w:w="2160"/>
+          </w:tcPr>
+          <w:p>
+            <w:r>
+              <w:t>Нужно сохранить всё как на REG.RU: /var/www, nginx, pm2, cron</w:t>
+            </w:r>
+          </w:p>
+        </w:tc>
+        <w:tc>
+          <w:tcPr>
+            <w:tcW w:type="dxa" w:w="2160"/>
+          </w:tcPr>
+          <w:p>
+            <w:r>
+              <w:t>Минимум ручной настройки, те же пути и .env</w:t>
+            </w:r>
+          </w:p>
+        </w:tc>
+        <w:tc>
+          <w:tcPr>
+            <w:tcW w:type="dxa" w:w="2160"/>
+          </w:tcPr>
+          <w:p>
+            <w:r>
+              <w:t>Нужно переустановить Node/nginx на Beget; SSL часто перевыпускают</w:t>
+            </w:r>
+          </w:p>
+        </w:tc>
+      </w:tr>
+      <w:tr>
+        <w:tc>
+          <w:tcPr>
+            <w:tcW w:type="dxa" w:w="2160"/>
+          </w:tcPr>
+          <w:p>
+            <w:r>
+              <w:t>B. Чистый Beget + только боты из Git</w:t>
+            </w:r>
+          </w:p>
+        </w:tc>
+        <w:tc>
+          <w:tcPr>
+            <w:tcW w:type="dxa" w:w="2160"/>
+          </w:tcPr>
+          <w:p>
+            <w:r>
+              <w:t>На REG.RU кроме boat/klinker ничего нет</w:t>
+            </w:r>
+          </w:p>
+        </w:tc>
+        <w:tc>
+          <w:tcPr>
+            <w:tcW w:type="dxa" w:w="2160"/>
+          </w:tcPr>
+          <w:p>
+            <w:r>
+              <w:t>Свежая система, меньше «мусора»</w:t>
+            </w:r>
+          </w:p>
+        </w:tc>
+        <w:tc>
+          <w:tcPr>
+            <w:tcW w:type="dxa" w:w="2160"/>
+          </w:tcPr>
+          <w:p>
+            <w:r>
+              <w:t>Не переносит другие сайты/скрипты на VPS</w:t>
+            </w:r>
+          </w:p>
+        </w:tc>
+      </w:tr>
+    </w:tbl>
+    <w:p/>
+    <w:p>
+      <w:r>
+        <w:rPr>
+          <w:b w:val="0"/>
+          <w:i w:val="0"/>
+          <w:sz w:val="22"/>
+        </w:rPr>
+        <w:t>Ниже описан способ A — перенос VPS со всем содержимым. Разделы 6–7 (git clone) — запасной вариант, если rsync не используете.</w:t>
+      </w:r>
+    </w:p>
+    <w:p>
+      <w:pPr>
+        <w:pStyle w:val="Heading2"/>
+      </w:pPr>
+      <w:r>
+        <w:t>1.3. Инвентаризация на REG.RU (обязательно)</w:t>
+      </w:r>
+    </w:p>
+    <w:p>
+      <w:r>
+        <w:rPr>
+          <w:b w:val="0"/>
+          <w:i w:val="0"/>
+          <w:sz w:val="22"/>
+        </w:rPr>
+        <w:t>Выполните на старом VPS и сохраните вывод в файл на свой ПК:</w:t>
+      </w:r>
+    </w:p>
+    <w:p>
+      <w:pPr>
+        <w:spacing w:before="80" w:after="80"/>
+        <w:ind w:left="283"/>
+      </w:pPr>
+      <w:r>
+        <w:rPr>
+          <w:rFonts w:ascii="Consolas" w:hAnsi="Consolas"/>
+          <w:sz w:val="18"/>
+        </w:rPr>
+        <w:t>ssh root@СТАРЫЙ_IP_REGRU</w:t>
+        <w:br/>
+        <w:t>mkdir -p ~/migration-export</w:t>
+        <w:br/>
+        <w:t>df -h | tee ~/migration-export/disk.txt</w:t>
+        <w:br/>
+        <w:t>ls -la /var/www | tee ~/migration-export/var-www.txt</w:t>
+        <w:br/>
+        <w:t>find /var/www -maxdepth 3 -type d 2&gt;/dev/null | tee ~/migration-export/var-www-dirs.txt</w:t>
+        <w:br/>
+        <w:t>ls -la /etc/nginx/sites-enabled/ | tee ~/migration-export/nginx-enabled.txt</w:t>
+        <w:br/>
+        <w:t>cat /etc/nginx/sites-enabled/* 2&gt;/dev/null | tee ~/migration-export/nginx-configs.txt</w:t>
+        <w:br/>
+        <w:t>ss -tlnp | tee ~/migration-export/ports.txt</w:t>
+        <w:br/>
+        <w:t>pm2 list | tee ~/migration-export/pm2-list.txt</w:t>
+        <w:br/>
+        <w:t>pm2 save</w:t>
+        <w:br/>
+        <w:t>systemctl list-unit-files --type=service --state=enabled | tee ~/migration-export/systemd.txt</w:t>
+        <w:br/>
+        <w:t>crontab -l 2&gt;/dev/null | tee ~/migration-export/cron-root.txt</w:t>
+        <w:br/>
+        <w:t>for u in deploy ubuntu www-data; do crontab -u $u -l 2&gt;/dev/null &gt;&gt; ~/migration-export/cron-users.txt; done</w:t>
+        <w:br/>
+        <w:t>docker ps -a 2&gt;/dev/null | tee ~/migration-export/docker.txt</w:t>
+        <w:br/>
+        <w:t>tar czf ~/migration-export-$(date +%Y%m%d).tar.gz ~/migration-export</w:t>
+        <w:br/>
+        <w:t>scp root@СТАРЫЙ_IP_REGRU:~/migration-export-*.tar.gz .</w:t>
+      </w:r>
+    </w:p>
+    <w:p>
+      <w:r>
+        <w:rPr>
+          <w:b w:val="0"/>
+          <w:i w:val="0"/>
+          <w:sz w:val="22"/>
+        </w:rPr>
+        <w:t>В панели REG.RU выпишите все A- и CNAME-записи доменов, которые указывают на IP этого VPS (не только webtaxi2.ru — любые сайты, API, почта если на том же IP).</w:t>
+      </w:r>
+    </w:p>
+    <w:p>
+      <w:pPr>
+        <w:pStyle w:val="Heading2"/>
+      </w:pPr>
+      <w:r>
+        <w:t>1.4. Rsync: копирование содержимого на Beget</w:t>
+      </w:r>
+    </w:p>
+    <w:p>
+      <w:r>
+        <w:rPr>
+          <w:b w:val="0"/>
+          <w:i w:val="0"/>
+          <w:sz w:val="22"/>
+        </w:rPr>
+        <w:t>Сначала на Beget: базовая Ubuntu, пользователь deploy, открыты порты 22/80/443 (раздел 4). Команды выполняйте на новом VPS Beget. Подставьте IP REG.RU.</w:t>
+      </w:r>
+    </w:p>
+    <w:p>
+      <w:pPr>
+        <w:spacing w:before="80" w:after="80"/>
+        <w:ind w:left="283"/>
+      </w:pPr>
+      <w:r>
+        <w:rPr>
+          <w:rFonts w:ascii="Consolas" w:hAnsi="Consolas"/>
+          <w:sz w:val="18"/>
+        </w:rPr>
+        <w:t>OLD=root@СТАРЫЙ_IP_REGRU</w:t>
+        <w:br/>
+        <w:t>mkdir -p /root/migration/nginx-backup</w:t>
+        <w:br/>
+        <w:br/>
+        <w:t># 1) Все сайты и боты</w:t>
+        <w:br/>
+        <w:t>rsync -avz --progress -e ssh $OLD:/var/www/ /var/www/</w:t>
+        <w:br/>
+        <w:br/>
+        <w:t># 2) Репозиторий Igor (если не в /var/www)</w:t>
+        <w:br/>
+        <w:t>rsync -avz --progress -e ssh $OLD:/root/igor/ /root/igor/ 2&gt;/dev/null || true</w:t>
+        <w:br/>
+        <w:t>rsync -avz --progress -e ssh $OLD:/home/deploy/ /home/deploy/ 2&gt;/dev/null || true</w:t>
+        <w:br/>
+        <w:br/>
+        <w:t># 3) Nginx — сначала в backup, потом вручную в sites-available</w:t>
+        <w:br/>
+        <w:t>rsync -avz -e ssh $OLD:/etc/nginx/sites-available/ /root/migration/nginx-backup/sites-available/</w:t>
+        <w:br/>
+        <w:t>rsync -avz -e ssh $OLD:/etc/nginx/nginx.conf /root/migration/nginx-backup/nginx.conf</w:t>
+        <w:br/>
+        <w:br/>
+        <w:t># 4) pm2 (список процессов и логи)</w:t>
+        <w:br/>
+        <w:t>rsync -avz -e ssh $OLD:/root/.pm2/dump.pm2 /root/.pm2/dump.pm2 2&gt;/dev/null || true</w:t>
+        <w:br/>
+        <w:br/>
+        <w:t># 5) Cron</w:t>
+        <w:br/>
+        <w:t>scp $OLD:/var/spool/cron/crontabs/root /root/migration/cron-root 2&gt;/dev/null || true</w:t>
+      </w:r>
+    </w:p>
+    <w:p>
+      <w:r>
+        <w:rPr>
+          <w:b w:val="0"/>
+          <w:i w:val="0"/>
+          <w:sz w:val="22"/>
+        </w:rPr>
+        <w:t>Опционально (ускоряет, но может перенести лишнее): исключить node_modules и .git — после rsync в каждом проекте выполнить npm install.</w:t>
+      </w:r>
+    </w:p>
+    <w:p>
+      <w:pPr>
+        <w:spacing w:before="80" w:after="80"/>
+        <w:ind w:left="283"/>
+      </w:pPr>
+      <w:r>
+        <w:rPr>
+          <w:rFonts w:ascii="Consolas" w:hAnsi="Consolas"/>
+          <w:sz w:val="18"/>
+        </w:rPr>
+        <w:t>rsync -avz --progress --exclude 'node_modules' --exclude '.git' \</w:t>
+        <w:br/>
+        <w:t xml:space="preserve">  -e ssh $OLD:/var/www/ /var/www/</w:t>
+      </w:r>
+    </w:p>
+    <w:p>
+      <w:pPr>
+        <w:pStyle w:val="Heading3"/>
+      </w:pPr>
+      <w:r>
+        <w:t>1.4.1. Что не копировать с REG.RU</w:t>
+      </w:r>
+    </w:p>
+    <w:p>
+      <w:pPr>
+        <w:pStyle w:val="ListBullet"/>
+      </w:pPr>
+      <w:r>
+        <w:rPr>
+          <w:sz w:val="22"/>
+        </w:rPr>
+        <w:t>Весь диск или каталоги /etc целиком — сеть, hostname и пакеты могут не совпасть с Beget.</w:t>
+      </w:r>
+    </w:p>
+    <w:p>
+      <w:pPr>
+        <w:pStyle w:val="ListBullet"/>
+      </w:pPr>
+      <w:r>
+        <w:rPr>
+          <w:sz w:val="22"/>
+        </w:rPr>
+        <w:t>/proc, /sys, /dev, /boot — не переносятся.</w:t>
+      </w:r>
+    </w:p>
+    <w:p>
+      <w:pPr>
+        <w:pStyle w:val="ListBullet"/>
+      </w:pPr>
+      <w:r>
+        <w:rPr>
+          <w:sz w:val="22"/>
+        </w:rPr>
+        <w:t>Старые логи (/var/log) — по желанию; для работы не нужны.</w:t>
+      </w:r>
+    </w:p>
+    <w:p>
+      <w:pPr>
+        <w:pStyle w:val="ListBullet"/>
+      </w:pPr>
+      <w:r>
+        <w:rPr>
+          <w:sz w:val="22"/>
+        </w:rPr>
+        <w:t>Кэш apt — не нужен.</w:t>
+      </w:r>
+    </w:p>
+    <w:p>
+      <w:pPr>
+        <w:pStyle w:val="Heading2"/>
+      </w:pPr>
+      <w:r>
+        <w:t>1.5. После rsync: включить сервисы на Beget</w:t>
+      </w:r>
+    </w:p>
+    <w:p>
+      <w:pPr>
+        <w:spacing w:before="80" w:after="80"/>
+        <w:ind w:left="283"/>
+      </w:pPr>
+      <w:r>
+        <w:rPr>
+          <w:rFonts w:ascii="Consolas" w:hAnsi="Consolas"/>
+          <w:sz w:val="18"/>
+        </w:rPr>
+        <w:t># Node + pm2 (раздел 5), затем:</w:t>
+        <w:br/>
+        <w:t>cd /var/www/boat-sochi-bot &amp;&amp; npm install</w:t>
+        <w:br/>
+        <w:t>cd /var/www/igor/bots/klinkerpro-bot &amp;&amp; npm install   # путь уточните по find</w:t>
+        <w:br/>
+        <w:br/>
+        <w:t>cp /root/migration/nginx-backup/sites-available/* /etc/nginx/sites-available/</w:t>
+        <w:br/>
+        <w:t>ln -sf /etc/nginx/sites-available/* /etc/nginx/sites-enabled/ 2&gt;/dev/null</w:t>
+        <w:br/>
+        <w:t>nginx -t &amp;&amp; systemctl reload nginx</w:t>
+        <w:br/>
+        <w:br/>
+        <w:t>pm2 resurrect    # если перенесли dump.pm2</w:t>
+        <w:br/>
+        <w:t># или вручную:</w:t>
+        <w:br/>
+        <w:t>pm2 start /var/www/boat-sochi-bot/src/index.js --name boat-sochi</w:t>
+        <w:br/>
+        <w:t>pm2 start /var/www/igor/bots/klinkerpro-bot/src/index.js --name klinkerpro</w:t>
+        <w:br/>
+        <w:t>pm2 save &amp;&amp; pm2 startup</w:t>
+      </w:r>
+    </w:p>
+    <w:p>
+      <w:r>
+        <w:rPr>
+          <w:b w:val="0"/>
+          <w:i w:val="0"/>
+          <w:sz w:val="22"/>
+        </w:rPr>
+        <w:t>SSL: проще перевыпустить certbot на Beget (раздел 9), чем копировать /etc/letsencrypt — сертификаты привязаны к серверу. До смены DNS certbot можно запустить в режиме DNS уже после переключения A-записей.</w:t>
+      </w:r>
+    </w:p>
+    <w:p>
+      <w:pPr>
+        <w:pStyle w:val="Heading2"/>
+      </w:pPr>
+      <w:r>
+        <w:t>1.6. DNS: все записи на IP Beget</w:t>
+      </w:r>
+    </w:p>
+    <w:p>
+      <w:r>
+        <w:rPr>
+          <w:b w:val="0"/>
+          <w:i w:val="0"/>
+          <w:sz w:val="22"/>
+        </w:rPr>
+        <w:t>В REG.RU (или Beget, если DNS уже там) замените IP во всех A-записях, которые вели на VPS REG.RU:</w:t>
+      </w:r>
+    </w:p>
+    <w:tbl>
+      <w:tblPr>
+        <w:tblStyle w:val="TableGrid"/>
+        <w:tblW w:type="auto" w:w="0"/>
+        <w:tblLook w:firstColumn="1" w:firstRow="1" w:lastColumn="0" w:lastRow="0" w:noHBand="0" w:noVBand="1" w:val="04A0"/>
+      </w:tblPr>
+      <w:tblGrid>
+        <w:gridCol w:w="4320"/>
+        <w:gridCol w:w="4320"/>
+      </w:tblGrid>
+      <w:tr>
+        <w:tc>
+          <w:tcPr>
+            <w:tcW w:type="dxa" w:w="4320"/>
+          </w:tcPr>
+          <w:p>
+            <w:r>
+              <w:rPr>
+                <w:b/>
+              </w:rPr>
+              <w:t>Запись</w:t>
+            </w:r>
+          </w:p>
+        </w:tc>
+        <w:tc>
+          <w:tcPr>
+            <w:tcW w:type="dxa" w:w="4320"/>
+          </w:tcPr>
+          <w:p>
+            <w:r>
+              <w:rPr>
+                <w:b/>
+              </w:rPr>
+              <w:t>Действие</w:t>
+            </w:r>
+          </w:p>
+        </w:tc>
+      </w:tr>
+      <w:tr>
+        <w:tc>
+          <w:tcPr>
+            <w:tcW w:type="dxa" w:w="4320"/>
+          </w:tcPr>
+          <w:p>
+            <w:r>
+              <w:t>@ или www (если сайт на VPS)</w:t>
+            </w:r>
+          </w:p>
+        </w:tc>
+        <w:tc>
+          <w:tcPr>
+            <w:tcW w:type="dxa" w:w="4320"/>
+          </w:tcPr>
+          <w:p>
+            <w:r>
+              <w:t>A → новый IP Beget</w:t>
+            </w:r>
+          </w:p>
+        </w:tc>
+      </w:tr>
+      <w:tr>
+        <w:tc>
+          <w:tcPr>
+            <w:tcW w:type="dxa" w:w="4320"/>
+          </w:tcPr>
+          <w:p>
+            <w:r>
+              <w:t>boat, klinker (webtaxi2.ru)</w:t>
+            </w:r>
+          </w:p>
+        </w:tc>
+        <w:tc>
+          <w:tcPr>
+            <w:tcW w:type="dxa" w:w="4320"/>
+          </w:tcPr>
+          <w:p>
+            <w:r>
+              <w:t>A → новый IP Beget</w:t>
+            </w:r>
+          </w:p>
+        </w:tc>
+      </w:tr>
+      <w:tr>
+        <w:tc>
+          <w:tcPr>
+            <w:tcW w:type="dxa" w:w="4320"/>
+          </w:tcPr>
+          <w:p>
+            <w:r>
+              <w:t>Любые другие поддомены на тот же IP</w:t>
+            </w:r>
+          </w:p>
+        </w:tc>
+        <w:tc>
+          <w:tcPr>
+            <w:tcW w:type="dxa" w:w="4320"/>
+          </w:tcPr>
+          <w:p>
+            <w:r>
+              <w:t>A → новый IP Beget</w:t>
+            </w:r>
+          </w:p>
+        </w:tc>
+      </w:tr>
+      <w:tr>
+        <w:tc>
+          <w:tcPr>
+            <w:tcW w:type="dxa" w:w="4320"/>
+          </w:tcPr>
+          <w:p>
+            <w:r>
+              <w:t>TTL</w:t>
+            </w:r>
+          </w:p>
+        </w:tc>
+        <w:tc>
+          <w:tcPr>
+            <w:tcW w:type="dxa" w:w="4320"/>
+          </w:tcPr>
+          <w:p>
+            <w:r>
+              <w:t>За сутки до переезда поставьте 300–600 сек для быстрого отката</w:t>
+            </w:r>
+          </w:p>
+        </w:tc>
+      </w:tr>
+    </w:tbl>
+    <w:p/>
+    <w:p>
+      <w:r>
+        <w:rPr>
+          <w:b w:val="0"/>
+          <w:i w:val="0"/>
+          <w:sz w:val="22"/>
+        </w:rPr>
+        <w:t>Пока DNS старый — не останавливайте REG.RU VPS. После переключения проверьте сайты и health ботов.</w:t>
+      </w:r>
+    </w:p>
+    <w:p>
+      <w:pPr>
         <w:pStyle w:val="Heading1"/>
       </w:pPr>
       <w:r>
@@ -688,7 +1288,7 @@
         <w:rPr>
           <w:sz w:val="22"/>
         </w:rPr>
-        <w:t>Минимум: 1 vCPU, 1–2 GB RAM, 10 GB SSD — достаточно для двух лёгких Node.js-ботов.</w:t>
+        <w:t>Объём диска и RAM — не меньше, чем на REG.RU (смотрите df -h и тариф в кабинете REG.RU).</w:t>
       </w:r>
     </w:p>
     <w:p>
@@ -699,7 +1299,18 @@
         <w:rPr>
           <w:sz w:val="22"/>
         </w:rPr>
-        <w:t>Рекомендуется: 2 vCPU, 2 GB RAM — запас под пики YandexGPT и certbot.</w:t>
+        <w:t>Минимум для только ботов: 1 vCPU, 2 GB RAM, 15 GB SSD.</w:t>
+      </w:r>
+    </w:p>
+    <w:p>
+      <w:pPr>
+        <w:pStyle w:val="ListBullet"/>
+      </w:pPr>
+      <w:r>
+        <w:rPr>
+          <w:sz w:val="22"/>
+        </w:rPr>
+        <w:t>Если в /var/www несколько сайтов — возьмите запас по SSD (×1.5 от занятого места).</w:t>
       </w:r>
     </w:p>
     <w:p>
@@ -2572,7 +3183,18 @@
         <w:rPr>
           <w:sz w:val="22"/>
         </w:rPr>
-        <w:t>Шаг 1. Развернуть оба бота на Beget, проверить health по IP/новому домену (до смены DNS).</w:t>
+        <w:t>Шаг 0. Инвентаризация и rsync (раздел 1.3–1.4) или git-деплой (разделы 6–7).</w:t>
+      </w:r>
+    </w:p>
+    <w:p>
+      <w:pPr>
+        <w:pStyle w:val="ListBullet"/>
+      </w:pPr>
+      <w:r>
+        <w:rPr>
+          <w:sz w:val="22"/>
+        </w:rPr>
+        <w:t>Шаг 1. На Beget поднять nginx + pm2, проверить curl http://127.0.0.1:3000/health локально.</w:t>
       </w:r>
     </w:p>
     <w:p>
@@ -2681,26 +3303,24 @@
           <w:rFonts w:ascii="Consolas" w:hAnsi="Consolas"/>
           <w:sz w:val="18"/>
         </w:rPr>
-        <w:t># на VPS REG.RU (по SSH):</w:t>
+        <w:t># на VPS REG.RU — полный архив /var/www (может быть большим):</w:t>
+        <w:br/>
+        <w:t>tar czf ~/backup-var-www-$(date +%Y%m%d).tar.gz /var/www</w:t>
         <w:br/>
         <w:t>tar czf ~/backup-bots-$(date +%Y%m%d).tar.gz \</w:t>
         <w:br/>
         <w:t xml:space="preserve">  /var/www/boat-sochi-bot/.env \</w:t>
         <w:br/>
-        <w:t xml:space="preserve">  /var/www/boat-sochi-bot/knowledge \</w:t>
+        <w:t xml:space="preserve">  /etc/nginx/sites-available \</w:t>
         <w:br/>
         <w:t xml:space="preserve">  /var/www/igor/bots/klinkerpro-bot/.env \</w:t>
         <w:br/>
         <w:t xml:space="preserve">  ~/igor/bots/klinkerpro-bot/.env 2&gt;/dev/null</w:t>
         <w:br/>
-        <w:t>pm2 save</w:t>
-        <w:br/>
-        <w:t>pm2 list &gt; ~/pm2-list.txt</w:t>
+        <w:t>pm2 save &amp;&amp; pm2 list &gt; ~/pm2-list.txt</w:t>
         <w:br/>
         <w:br/>
-        <w:t># скачать архив на свой ПК:</w:t>
-        <w:br/>
-        <w:t>scp root@СТАРЫЙ_IP_REGRU:~/backup-bots-*.tar.gz .</w:t>
+        <w:t>scp root@СТАРЫЙ_IP_REGRU:~/backup-*.tar.gz .</w:t>
       </w:r>
     </w:p>
     <w:p>
@@ -3385,6 +4005,102 @@
           </w:p>
         </w:tc>
       </w:tr>
+      <w:tr>
+        <w:tc>
+          <w:tcPr>
+            <w:tcW w:type="dxa" w:w="2880"/>
+          </w:tcPr>
+          <w:p>
+            <w:r>
+              <w:t>После rsync nginx -t падает</w:t>
+            </w:r>
+          </w:p>
+        </w:tc>
+        <w:tc>
+          <w:tcPr>
+            <w:tcW w:type="dxa" w:w="2880"/>
+          </w:tcPr>
+          <w:p>
+            <w:r>
+              <w:t>Старые пути SSL или IPv6</w:t>
+            </w:r>
+          </w:p>
+        </w:tc>
+        <w:tc>
+          <w:tcPr>
+            <w:tcW w:type="dxa" w:w="2880"/>
+          </w:tcPr>
+          <w:p>
+            <w:r>
+              <w:t>Поправить ssl_certificate; certbot --nginx</w:t>
+            </w:r>
+          </w:p>
+        </w:tc>
+      </w:tr>
+      <w:tr>
+        <w:tc>
+          <w:tcPr>
+            <w:tcW w:type="dxa" w:w="2880"/>
+          </w:tcPr>
+          <w:p>
+            <w:r>
+              <w:t>pm2 resurrect пустой</w:t>
+            </w:r>
+          </w:p>
+        </w:tc>
+        <w:tc>
+          <w:tcPr>
+            <w:tcW w:type="dxa" w:w="2880"/>
+          </w:tcPr>
+          <w:p>
+            <w:r>
+              <w:t>Не скопировали dump.pm2</w:t>
+            </w:r>
+          </w:p>
+        </w:tc>
+        <w:tc>
+          <w:tcPr>
+            <w:tcW w:type="dxa" w:w="2880"/>
+          </w:tcPr>
+          <w:p>
+            <w:r>
+              <w:t>pm2 start вручную по pm2-list.txt с REG.RU</w:t>
+            </w:r>
+          </w:p>
+        </w:tc>
+      </w:tr>
+      <w:tr>
+        <w:tc>
+          <w:tcPr>
+            <w:tcW w:type="dxa" w:w="2880"/>
+          </w:tcPr>
+          <w:p>
+            <w:r>
+              <w:t>Сайт открывает старый VPS</w:t>
+            </w:r>
+          </w:p>
+        </w:tc>
+        <w:tc>
+          <w:tcPr>
+            <w:tcW w:type="dxa" w:w="2880"/>
+          </w:tcPr>
+          <w:p>
+            <w:r>
+              <w:t>DNS не обновился</w:t>
+            </w:r>
+          </w:p>
+        </w:tc>
+        <w:tc>
+          <w:tcPr>
+            <w:tcW w:type="dxa" w:w="2880"/>
+          </w:tcPr>
+          <w:p>
+            <w:r>
+              <w:t>dig +short; сменить все A на Beget IP</w:t>
+            </w:r>
+          </w:p>
+        </w:tc>
+      </w:tr>
     </w:tbl>
     <w:p/>
     <w:p>

</xml_diff>